<commit_message>
First Hardhat based smart contract testing
</commit_message>
<xml_diff>
--- a/Lab Session 7.docx
+++ b/Lab Session 7.docx
@@ -1,13 +1,44 @@
 
 <file path=word/document.xml><?xml version="1.0" encoding="utf-8"?>
-<w:document xmlns:wpc="http://schemas.microsoft.com/office/word/2010/wordprocessingCanvas" xmlns:cx="http://schemas.microsoft.com/office/drawing/2014/chartex" xmlns:cx1="http://schemas.microsoft.com/office/drawing/2015/9/8/chartex" xmlns:cx2="http://schemas.microsoft.com/office/drawing/2015/10/21/chartex" xmlns:cx3="http://schemas.microsoft.com/office/drawing/2016/5/9/chartex" xmlns:cx4="http://schemas.microsoft.com/office/drawing/2016/5/10/chartex" xmlns:cx5="http://schemas.microsoft.com/office/drawing/2016/5/11/chartex" xmlns:cx6="http://schemas.microsoft.com/office/drawing/2016/5/12/chartex" xmlns:cx7="http://schemas.microsoft.com/office/drawing/2016/5/13/chartex" xmlns:cx8="http://schemas.microsoft.com/office/drawing/2016/5/14/chartex" xmlns:mc="http://schemas.openxmlformats.org/markup-compatibility/2006" xmlns:aink="http://schemas.microsoft.com/office/drawing/2016/ink" xmlns:am3d="http://schemas.microsoft.com/office/drawing/2017/model3d" xmlns:o="urn:schemas-microsoft-com:office:office" xmlns:r="http://schemas.openxmlformats.org/officeDocument/2006/relationships" xmlns:m="http://schemas.openxmlformats.org/officeDocument/2006/math" xmlns:v="urn:schemas-microsoft-com:vml" xmlns:wp14="http://schemas.microsoft.com/office/word/2010/wordprocessingDrawing" xmlns:wp="http://schemas.openxmlformats.org/drawingml/2006/wordprocessingDrawing" xmlns:w10="urn:schemas-microsoft-com:office:word" xmlns:w="http://schemas.openxmlformats.org/wordprocessingml/2006/main" xmlns:w14="http://schemas.microsoft.com/office/word/2010/wordml" xmlns:w15="http://schemas.microsoft.com/office/word/2012/wordml" xmlns:w16cid="http://schemas.microsoft.com/office/word/2016/wordml/cid" xmlns:w16se="http://schemas.microsoft.com/office/word/2015/wordml/symex" xmlns:wpg="http://schemas.microsoft.com/office/word/2010/wordprocessingGroup" xmlns:wpi="http://schemas.microsoft.com/office/word/2010/wordprocessingInk" xmlns:wne="http://schemas.microsoft.com/office/word/2006/wordml" xmlns:wps="http://schemas.microsoft.com/office/word/2010/wordprocessingShape" mc:Ignorable="w14 w15 w16se w16cid wp14">
+<w:document xmlns:wpc="http://schemas.microsoft.com/office/word/2010/wordprocessingCanvas" xmlns:cx="http://schemas.microsoft.com/office/drawing/2014/chartex" xmlns:cx1="http://schemas.microsoft.com/office/drawing/2015/9/8/chartex" xmlns:cx2="http://schemas.microsoft.com/office/drawing/2015/10/21/chartex" xmlns:cx3="http://schemas.microsoft.com/office/drawing/2016/5/9/chartex" xmlns:cx4="http://schemas.microsoft.com/office/drawing/2016/5/10/chartex" xmlns:cx5="http://schemas.microsoft.com/office/drawing/2016/5/11/chartex" xmlns:cx6="http://schemas.microsoft.com/office/drawing/2016/5/12/chartex" xmlns:cx7="http://schemas.microsoft.com/office/drawing/2016/5/13/chartex" xmlns:cx8="http://schemas.microsoft.com/office/drawing/2016/5/14/chartex" xmlns:mc="http://schemas.openxmlformats.org/markup-compatibility/2006" xmlns:aink="http://schemas.microsoft.com/office/drawing/2016/ink" xmlns:am3d="http://schemas.microsoft.com/office/drawing/2017/model3d" xmlns:o="urn:schemas-microsoft-com:office:office" xmlns:oel="http://schemas.microsoft.com/office/2019/extlst" xmlns:r="http://schemas.openxmlformats.org/officeDocument/2006/relationships" xmlns:m="http://schemas.openxmlformats.org/officeDocument/2006/math" xmlns:v="urn:schemas-microsoft-com:vml" xmlns:wp14="http://schemas.microsoft.com/office/word/2010/wordprocessingDrawing" xmlns:wp="http://schemas.openxmlformats.org/drawingml/2006/wordprocessingDrawing" xmlns:w10="urn:schemas-microsoft-com:office:word" xmlns:w="http://schemas.openxmlformats.org/wordprocessingml/2006/main" xmlns:w14="http://schemas.microsoft.com/office/word/2010/wordml" xmlns:w15="http://schemas.microsoft.com/office/word/2012/wordml" xmlns:w16cex="http://schemas.microsoft.com/office/word/2018/wordml/cex" xmlns:w16cid="http://schemas.microsoft.com/office/word/2016/wordml/cid" xmlns:w16="http://schemas.microsoft.com/office/word/2018/wordml" xmlns:w16du="http://schemas.microsoft.com/office/word/2023/wordml/word16du" xmlns:w16sdtdh="http://schemas.microsoft.com/office/word/2020/wordml/sdtdatahash" xmlns:w16sdtfl="http://schemas.microsoft.com/office/word/2024/wordml/sdtformatlock" xmlns:w16se="http://schemas.microsoft.com/office/word/2015/wordml/symex" xmlns:wpg="http://schemas.microsoft.com/office/word/2010/wordprocessingGroup" xmlns:wpi="http://schemas.microsoft.com/office/word/2010/wordprocessingInk" xmlns:wne="http://schemas.microsoft.com/office/word/2006/wordml" xmlns:wps="http://schemas.microsoft.com/office/word/2010/wordprocessingShape" mc:Ignorable="w14 w15 w16se w16cid w16 w16cex w16sdtdh w16sdtfl w16du wp14">
   <w:body>
     <w:p>
+      <w:pPr>
+        <w:jc w:val="center"/>
+        <w:rPr>
+          <w:b/>
+          <w:bCs/>
+          <w:sz w:val="32"/>
+          <w:szCs w:val="32"/>
+        </w:rPr>
+      </w:pPr>
       <w:r>
+        <w:rPr>
+          <w:b/>
+          <w:bCs/>
+          <w:sz w:val="32"/>
+          <w:szCs w:val="32"/>
+        </w:rPr>
+        <w:t>Lab Session 07</w:t>
+      </w:r>
+    </w:p>
+    <w:p>
+      <w:r>
+        <w:rPr>
+          <w:noProof/>
+        </w:rPr>
         <w:drawing>
-          <wp:inline distT="0" distB="0" distL="0" distR="0" wp14:anchorId="07564323" wp14:editId="72C99EC7">
-            <wp:extent cx="5731510" cy="3549015"/>
-            <wp:effectExtent l="0" t="0" r="2540" b="0"/>
+          <wp:anchor distT="0" distB="0" distL="114300" distR="114300" simplePos="0" relativeHeight="251658240" behindDoc="0" locked="0" layoutInCell="1" allowOverlap="1" wp14:anchorId="07564323" wp14:editId="7B7623BC">
+            <wp:simplePos x="0" y="0"/>
+            <wp:positionH relativeFrom="column">
+              <wp:posOffset>-12313</wp:posOffset>
+            </wp:positionH>
+            <wp:positionV relativeFrom="paragraph">
+              <wp:posOffset>113030</wp:posOffset>
+            </wp:positionV>
+            <wp:extent cx="3736738" cy="2313830"/>
+            <wp:effectExtent l="19050" t="19050" r="16510" b="10795"/>
+            <wp:wrapNone/>
             <wp:docPr id="1" name="Picture 1"/>
             <wp:cNvGraphicFramePr>
               <a:graphicFrameLocks xmlns:a="http://schemas.openxmlformats.org/drawingml/2006/main" noChangeAspect="1"/>
@@ -20,7 +51,13 @@
                     <pic:cNvPicPr/>
                   </pic:nvPicPr>
                   <pic:blipFill>
-                    <a:blip r:embed="rId4"/>
+                    <a:blip r:embed="rId6">
+                      <a:extLst>
+                        <a:ext uri="{28A0092B-C50C-407E-A947-70E740481C1C}">
+                          <a14:useLocalDpi xmlns:a14="http://schemas.microsoft.com/office/drawing/2010/main" val="0"/>
+                        </a:ext>
+                      </a:extLst>
+                    </a:blip>
                     <a:stretch>
                       <a:fillRect/>
                     </a:stretch>
@@ -28,26 +65,114 @@
                   <pic:spPr>
                     <a:xfrm>
                       <a:off x="0" y="0"/>
-                      <a:ext cx="5731510" cy="3549015"/>
+                      <a:ext cx="3736738" cy="2313830"/>
                     </a:xfrm>
                     <a:prstGeom prst="rect">
                       <a:avLst/>
                     </a:prstGeom>
+                    <a:ln w="19050">
+                      <a:solidFill>
+                        <a:schemeClr val="tx1"/>
+                      </a:solidFill>
+                    </a:ln>
                   </pic:spPr>
                 </pic:pic>
               </a:graphicData>
             </a:graphic>
-          </wp:inline>
+            <wp14:sizeRelH relativeFrom="margin">
+              <wp14:pctWidth>0</wp14:pctWidth>
+            </wp14:sizeRelH>
+            <wp14:sizeRelV relativeFrom="margin">
+              <wp14:pctHeight>0</wp14:pctHeight>
+            </wp14:sizeRelV>
+          </wp:anchor>
         </w:drawing>
       </w:r>
     </w:p>
     <w:p/>
+    <w:p/>
     <w:p>
       <w:r>
+        <w:rPr>
+          <w:noProof/>
+        </w:rPr>
         <w:drawing>
-          <wp:inline distT="0" distB="0" distL="0" distR="0" wp14:anchorId="3A50395B" wp14:editId="415FF4A2">
-            <wp:extent cx="5731510" cy="3489960"/>
-            <wp:effectExtent l="0" t="0" r="2540" b="0"/>
+          <wp:anchor distT="0" distB="0" distL="114300" distR="114300" simplePos="0" relativeHeight="251660288" behindDoc="0" locked="0" layoutInCell="1" allowOverlap="1" wp14:anchorId="6245E73D" wp14:editId="68D8EBCA">
+            <wp:simplePos x="0" y="0"/>
+            <wp:positionH relativeFrom="column">
+              <wp:posOffset>-13003</wp:posOffset>
+            </wp:positionH>
+            <wp:positionV relativeFrom="paragraph">
+              <wp:posOffset>4655185</wp:posOffset>
+            </wp:positionV>
+            <wp:extent cx="4431605" cy="2695492"/>
+            <wp:effectExtent l="19050" t="19050" r="26670" b="10160"/>
+            <wp:wrapNone/>
+            <wp:docPr id="3" name="Picture 3"/>
+            <wp:cNvGraphicFramePr>
+              <a:graphicFrameLocks xmlns:a="http://schemas.openxmlformats.org/drawingml/2006/main" noChangeAspect="1"/>
+            </wp:cNvGraphicFramePr>
+            <a:graphic xmlns:a="http://schemas.openxmlformats.org/drawingml/2006/main">
+              <a:graphicData uri="http://schemas.openxmlformats.org/drawingml/2006/picture">
+                <pic:pic xmlns:pic="http://schemas.openxmlformats.org/drawingml/2006/picture">
+                  <pic:nvPicPr>
+                    <pic:cNvPr id="1" name=""/>
+                    <pic:cNvPicPr/>
+                  </pic:nvPicPr>
+                  <pic:blipFill>
+                    <a:blip r:embed="rId7">
+                      <a:extLst>
+                        <a:ext uri="{28A0092B-C50C-407E-A947-70E740481C1C}">
+                          <a14:useLocalDpi xmlns:a14="http://schemas.microsoft.com/office/drawing/2010/main" val="0"/>
+                        </a:ext>
+                      </a:extLst>
+                    </a:blip>
+                    <a:stretch>
+                      <a:fillRect/>
+                    </a:stretch>
+                  </pic:blipFill>
+                  <pic:spPr>
+                    <a:xfrm>
+                      <a:off x="0" y="0"/>
+                      <a:ext cx="4431605" cy="2695492"/>
+                    </a:xfrm>
+                    <a:prstGeom prst="rect">
+                      <a:avLst/>
+                    </a:prstGeom>
+                    <a:ln w="19050">
+                      <a:solidFill>
+                        <a:schemeClr val="tx1"/>
+                      </a:solidFill>
+                    </a:ln>
+                  </pic:spPr>
+                </pic:pic>
+              </a:graphicData>
+            </a:graphic>
+            <wp14:sizeRelH relativeFrom="margin">
+              <wp14:pctWidth>0</wp14:pctWidth>
+            </wp14:sizeRelH>
+            <wp14:sizeRelV relativeFrom="margin">
+              <wp14:pctHeight>0</wp14:pctHeight>
+            </wp14:sizeRelV>
+          </wp:anchor>
+        </w:drawing>
+      </w:r>
+      <w:r>
+        <w:rPr>
+          <w:noProof/>
+        </w:rPr>
+        <w:drawing>
+          <wp:anchor distT="0" distB="0" distL="114300" distR="114300" simplePos="0" relativeHeight="251659264" behindDoc="0" locked="0" layoutInCell="1" allowOverlap="1" wp14:anchorId="3A50395B" wp14:editId="7133E3DA">
+            <wp:simplePos x="0" y="0"/>
+            <wp:positionH relativeFrom="column">
+              <wp:posOffset>1480682</wp:posOffset>
+            </wp:positionH>
+            <wp:positionV relativeFrom="paragraph">
+              <wp:posOffset>1783715</wp:posOffset>
+            </wp:positionV>
+            <wp:extent cx="4229804" cy="2575560"/>
+            <wp:effectExtent l="19050" t="19050" r="18415" b="15240"/>
+            <wp:wrapNone/>
             <wp:docPr id="2" name="Picture 2"/>
             <wp:cNvGraphicFramePr>
               <a:graphicFrameLocks xmlns:a="http://schemas.openxmlformats.org/drawingml/2006/main" noChangeAspect="1"/>
@@ -60,7 +185,13 @@
                     <pic:cNvPicPr/>
                   </pic:nvPicPr>
                   <pic:blipFill>
-                    <a:blip r:embed="rId5"/>
+                    <a:blip r:embed="rId8">
+                      <a:extLst>
+                        <a:ext uri="{28A0092B-C50C-407E-A947-70E740481C1C}">
+                          <a14:useLocalDpi xmlns:a14="http://schemas.microsoft.com/office/drawing/2010/main" val="0"/>
+                        </a:ext>
+                      </a:extLst>
+                    </a:blip>
                     <a:stretch>
                       <a:fillRect/>
                     </a:stretch>
@@ -68,64 +199,32 @@
                   <pic:spPr>
                     <a:xfrm>
                       <a:off x="0" y="0"/>
-                      <a:ext cx="5731510" cy="3489960"/>
+                      <a:ext cx="4229804" cy="2575560"/>
                     </a:xfrm>
                     <a:prstGeom prst="rect">
                       <a:avLst/>
                     </a:prstGeom>
+                    <a:ln w="19050">
+                      <a:solidFill>
+                        <a:schemeClr val="tx1"/>
+                      </a:solidFill>
+                    </a:ln>
                   </pic:spPr>
                 </pic:pic>
               </a:graphicData>
             </a:graphic>
-          </wp:inline>
+            <wp14:sizeRelH relativeFrom="margin">
+              <wp14:pctWidth>0</wp14:pctWidth>
+            </wp14:sizeRelH>
+            <wp14:sizeRelV relativeFrom="margin">
+              <wp14:pctHeight>0</wp14:pctHeight>
+            </wp14:sizeRelV>
+          </wp:anchor>
         </w:drawing>
       </w:r>
     </w:p>
-    <w:p>
-      <w:r>
-        <w:lastRenderedPageBreak/>
-        <w:drawing>
-          <wp:inline distT="0" distB="0" distL="0" distR="0" wp14:anchorId="6245E73D" wp14:editId="634DD33C">
-            <wp:extent cx="5731510" cy="3486150"/>
-            <wp:effectExtent l="0" t="0" r="2540" b="0"/>
-            <wp:docPr id="3" name="Picture 3"/>
-            <wp:cNvGraphicFramePr>
-              <a:graphicFrameLocks xmlns:a="http://schemas.openxmlformats.org/drawingml/2006/main" noChangeAspect="1"/>
-            </wp:cNvGraphicFramePr>
-            <a:graphic xmlns:a="http://schemas.openxmlformats.org/drawingml/2006/main">
-              <a:graphicData uri="http://schemas.openxmlformats.org/drawingml/2006/picture">
-                <pic:pic xmlns:pic="http://schemas.openxmlformats.org/drawingml/2006/picture">
-                  <pic:nvPicPr>
-                    <pic:cNvPr id="1" name=""/>
-                    <pic:cNvPicPr/>
-                  </pic:nvPicPr>
-                  <pic:blipFill>
-                    <a:blip r:embed="rId6"/>
-                    <a:stretch>
-                      <a:fillRect/>
-                    </a:stretch>
-                  </pic:blipFill>
-                  <pic:spPr>
-                    <a:xfrm>
-                      <a:off x="0" y="0"/>
-                      <a:ext cx="5731510" cy="3486150"/>
-                    </a:xfrm>
-                    <a:prstGeom prst="rect">
-                      <a:avLst/>
-                    </a:prstGeom>
-                  </pic:spPr>
-                </pic:pic>
-              </a:graphicData>
-            </a:graphic>
-          </wp:inline>
-        </w:drawing>
-      </w:r>
-    </w:p>
-    <w:p>
-      <w:bookmarkStart w:id="0" w:name="_GoBack"/>
-      <w:bookmarkEnd w:id="0"/>
-    </w:p>
     <w:sectPr>
+      <w:headerReference w:type="default" r:id="rId9"/>
       <w:pgSz w:w="11906" w:h="16838"/>
       <w:pgMar w:top="1440" w:right="1440" w:bottom="1440" w:left="1440" w:header="720" w:footer="720" w:gutter="0"/>
       <w:cols w:space="720"/>
@@ -135,8 +234,92 @@
 </w:document>
 </file>
 
+<file path=word/endnotes.xml><?xml version="1.0" encoding="utf-8"?>
+<w:endnotes xmlns:wpc="http://schemas.microsoft.com/office/word/2010/wordprocessingCanvas" xmlns:cx="http://schemas.microsoft.com/office/drawing/2014/chartex" xmlns:cx1="http://schemas.microsoft.com/office/drawing/2015/9/8/chartex" xmlns:cx2="http://schemas.microsoft.com/office/drawing/2015/10/21/chartex" xmlns:cx3="http://schemas.microsoft.com/office/drawing/2016/5/9/chartex" xmlns:cx4="http://schemas.microsoft.com/office/drawing/2016/5/10/chartex" xmlns:cx5="http://schemas.microsoft.com/office/drawing/2016/5/11/chartex" xmlns:cx6="http://schemas.microsoft.com/office/drawing/2016/5/12/chartex" xmlns:cx7="http://schemas.microsoft.com/office/drawing/2016/5/13/chartex" xmlns:cx8="http://schemas.microsoft.com/office/drawing/2016/5/14/chartex" xmlns:mc="http://schemas.openxmlformats.org/markup-compatibility/2006" xmlns:aink="http://schemas.microsoft.com/office/drawing/2016/ink" xmlns:am3d="http://schemas.microsoft.com/office/drawing/2017/model3d" xmlns:o="urn:schemas-microsoft-com:office:office" xmlns:oel="http://schemas.microsoft.com/office/2019/extlst" xmlns:r="http://schemas.openxmlformats.org/officeDocument/2006/relationships" xmlns:m="http://schemas.openxmlformats.org/officeDocument/2006/math" xmlns:v="urn:schemas-microsoft-com:vml" xmlns:wp14="http://schemas.microsoft.com/office/word/2010/wordprocessingDrawing" xmlns:wp="http://schemas.openxmlformats.org/drawingml/2006/wordprocessingDrawing" xmlns:w10="urn:schemas-microsoft-com:office:word" xmlns:w="http://schemas.openxmlformats.org/wordprocessingml/2006/main" xmlns:w14="http://schemas.microsoft.com/office/word/2010/wordml" xmlns:w15="http://schemas.microsoft.com/office/word/2012/wordml" xmlns:w16cex="http://schemas.microsoft.com/office/word/2018/wordml/cex" xmlns:w16cid="http://schemas.microsoft.com/office/word/2016/wordml/cid" xmlns:w16="http://schemas.microsoft.com/office/word/2018/wordml" xmlns:w16du="http://schemas.microsoft.com/office/word/2023/wordml/word16du" xmlns:w16sdtdh="http://schemas.microsoft.com/office/word/2020/wordml/sdtdatahash" xmlns:w16sdtfl="http://schemas.microsoft.com/office/word/2024/wordml/sdtformatlock" xmlns:w16se="http://schemas.microsoft.com/office/word/2015/wordml/symex" xmlns:wpg="http://schemas.microsoft.com/office/word/2010/wordprocessingGroup" xmlns:wpi="http://schemas.microsoft.com/office/word/2010/wordprocessingInk" xmlns:wne="http://schemas.microsoft.com/office/word/2006/wordml" xmlns:wps="http://schemas.microsoft.com/office/word/2010/wordprocessingShape" mc:Ignorable="w14 w15 w16se w16cid w16 w16cex w16sdtdh w16sdtfl w16du wp14">
+  <w:endnote w:type="separator" w:id="-1">
+    <w:p>
+      <w:pPr>
+        <w:spacing w:after="0" w:line="240" w:lineRule="auto"/>
+      </w:pPr>
+      <w:r>
+        <w:separator/>
+      </w:r>
+    </w:p>
+  </w:endnote>
+  <w:endnote w:type="continuationSeparator" w:id="0">
+    <w:p>
+      <w:pPr>
+        <w:spacing w:after="0" w:line="240" w:lineRule="auto"/>
+      </w:pPr>
+      <w:r>
+        <w:continuationSeparator/>
+      </w:r>
+    </w:p>
+  </w:endnote>
+</w:endnotes>
+</file>
+
+<file path=word/footnotes.xml><?xml version="1.0" encoding="utf-8"?>
+<w:footnotes xmlns:wpc="http://schemas.microsoft.com/office/word/2010/wordprocessingCanvas" xmlns:cx="http://schemas.microsoft.com/office/drawing/2014/chartex" xmlns:cx1="http://schemas.microsoft.com/office/drawing/2015/9/8/chartex" xmlns:cx2="http://schemas.microsoft.com/office/drawing/2015/10/21/chartex" xmlns:cx3="http://schemas.microsoft.com/office/drawing/2016/5/9/chartex" xmlns:cx4="http://schemas.microsoft.com/office/drawing/2016/5/10/chartex" xmlns:cx5="http://schemas.microsoft.com/office/drawing/2016/5/11/chartex" xmlns:cx6="http://schemas.microsoft.com/office/drawing/2016/5/12/chartex" xmlns:cx7="http://schemas.microsoft.com/office/drawing/2016/5/13/chartex" xmlns:cx8="http://schemas.microsoft.com/office/drawing/2016/5/14/chartex" xmlns:mc="http://schemas.openxmlformats.org/markup-compatibility/2006" xmlns:aink="http://schemas.microsoft.com/office/drawing/2016/ink" xmlns:am3d="http://schemas.microsoft.com/office/drawing/2017/model3d" xmlns:o="urn:schemas-microsoft-com:office:office" xmlns:oel="http://schemas.microsoft.com/office/2019/extlst" xmlns:r="http://schemas.openxmlformats.org/officeDocument/2006/relationships" xmlns:m="http://schemas.openxmlformats.org/officeDocument/2006/math" xmlns:v="urn:schemas-microsoft-com:vml" xmlns:wp14="http://schemas.microsoft.com/office/word/2010/wordprocessingDrawing" xmlns:wp="http://schemas.openxmlformats.org/drawingml/2006/wordprocessingDrawing" xmlns:w10="urn:schemas-microsoft-com:office:word" xmlns:w="http://schemas.openxmlformats.org/wordprocessingml/2006/main" xmlns:w14="http://schemas.microsoft.com/office/word/2010/wordml" xmlns:w15="http://schemas.microsoft.com/office/word/2012/wordml" xmlns:w16cex="http://schemas.microsoft.com/office/word/2018/wordml/cex" xmlns:w16cid="http://schemas.microsoft.com/office/word/2016/wordml/cid" xmlns:w16="http://schemas.microsoft.com/office/word/2018/wordml" xmlns:w16du="http://schemas.microsoft.com/office/word/2023/wordml/word16du" xmlns:w16sdtdh="http://schemas.microsoft.com/office/word/2020/wordml/sdtdatahash" xmlns:w16sdtfl="http://schemas.microsoft.com/office/word/2024/wordml/sdtformatlock" xmlns:w16se="http://schemas.microsoft.com/office/word/2015/wordml/symex" xmlns:wpg="http://schemas.microsoft.com/office/word/2010/wordprocessingGroup" xmlns:wpi="http://schemas.microsoft.com/office/word/2010/wordprocessingInk" xmlns:wne="http://schemas.microsoft.com/office/word/2006/wordml" xmlns:wps="http://schemas.microsoft.com/office/word/2010/wordprocessingShape" mc:Ignorable="w14 w15 w16se w16cid w16 w16cex w16sdtdh w16sdtfl w16du wp14">
+  <w:footnote w:type="separator" w:id="-1">
+    <w:p>
+      <w:pPr>
+        <w:spacing w:after="0" w:line="240" w:lineRule="auto"/>
+      </w:pPr>
+      <w:r>
+        <w:separator/>
+      </w:r>
+    </w:p>
+  </w:footnote>
+  <w:footnote w:type="continuationSeparator" w:id="0">
+    <w:p>
+      <w:pPr>
+        <w:spacing w:after="0" w:line="240" w:lineRule="auto"/>
+      </w:pPr>
+      <w:r>
+        <w:continuationSeparator/>
+      </w:r>
+    </w:p>
+  </w:footnote>
+</w:footnotes>
+</file>
+
+<file path=word/header1.xml><?xml version="1.0" encoding="utf-8"?>
+<w:hdr xmlns:wpc="http://schemas.microsoft.com/office/word/2010/wordprocessingCanvas" xmlns:cx="http://schemas.microsoft.com/office/drawing/2014/chartex" xmlns:cx1="http://schemas.microsoft.com/office/drawing/2015/9/8/chartex" xmlns:cx2="http://schemas.microsoft.com/office/drawing/2015/10/21/chartex" xmlns:cx3="http://schemas.microsoft.com/office/drawing/2016/5/9/chartex" xmlns:cx4="http://schemas.microsoft.com/office/drawing/2016/5/10/chartex" xmlns:cx5="http://schemas.microsoft.com/office/drawing/2016/5/11/chartex" xmlns:cx6="http://schemas.microsoft.com/office/drawing/2016/5/12/chartex" xmlns:cx7="http://schemas.microsoft.com/office/drawing/2016/5/13/chartex" xmlns:cx8="http://schemas.microsoft.com/office/drawing/2016/5/14/chartex" xmlns:mc="http://schemas.openxmlformats.org/markup-compatibility/2006" xmlns:aink="http://schemas.microsoft.com/office/drawing/2016/ink" xmlns:am3d="http://schemas.microsoft.com/office/drawing/2017/model3d" xmlns:o="urn:schemas-microsoft-com:office:office" xmlns:oel="http://schemas.microsoft.com/office/2019/extlst" xmlns:r="http://schemas.openxmlformats.org/officeDocument/2006/relationships" xmlns:m="http://schemas.openxmlformats.org/officeDocument/2006/math" xmlns:v="urn:schemas-microsoft-com:vml" xmlns:wp14="http://schemas.microsoft.com/office/word/2010/wordprocessingDrawing" xmlns:wp="http://schemas.openxmlformats.org/drawingml/2006/wordprocessingDrawing" xmlns:w10="urn:schemas-microsoft-com:office:word" xmlns:w="http://schemas.openxmlformats.org/wordprocessingml/2006/main" xmlns:w14="http://schemas.microsoft.com/office/word/2010/wordml" xmlns:w15="http://schemas.microsoft.com/office/word/2012/wordml" xmlns:w16cex="http://schemas.microsoft.com/office/word/2018/wordml/cex" xmlns:w16cid="http://schemas.microsoft.com/office/word/2016/wordml/cid" xmlns:w16="http://schemas.microsoft.com/office/word/2018/wordml" xmlns:w16du="http://schemas.microsoft.com/office/word/2023/wordml/word16du" xmlns:w16sdtdh="http://schemas.microsoft.com/office/word/2020/wordml/sdtdatahash" xmlns:w16sdtfl="http://schemas.microsoft.com/office/word/2024/wordml/sdtformatlock" xmlns:w16se="http://schemas.microsoft.com/office/word/2015/wordml/symex" xmlns:wpg="http://schemas.microsoft.com/office/word/2010/wordprocessingGroup" xmlns:wpi="http://schemas.microsoft.com/office/word/2010/wordprocessingInk" xmlns:wne="http://schemas.microsoft.com/office/word/2006/wordml" xmlns:wps="http://schemas.microsoft.com/office/word/2010/wordprocessingShape" mc:Ignorable="w14 w15 w16se w16cid w16 w16cex w16sdtdh w16sdtfl w16du wp14">
+  <w:p>
+    <w:pPr>
+      <w:pStyle w:val="Header"/>
+    </w:pPr>
+    <w:r>
+      <w:t>USMAN RASHEED SIDDIQUI</w:t>
+    </w:r>
+    <w:r>
+      <w:tab/>
+    </w:r>
+    <w:r>
+      <w:tab/>
+      <w:t xml:space="preserve">          CS-24038</w:t>
+    </w:r>
+  </w:p>
+  <w:p>
+    <w:pPr>
+      <w:pStyle w:val="Header"/>
+    </w:pPr>
+    <w:r>
+      <w:t>NED UNIVERSITY OF ENGINEERING AND TECHNOLOGY</w:t>
+    </w:r>
+    <w:r>
+      <w:tab/>
+    </w:r>
+    <w:r>
+      <w:t>ARTIFICIAL INTELLIGENCE</w:t>
+    </w:r>
+  </w:p>
+</w:hdr>
+</file>
+
 <file path=word/styles.xml><?xml version="1.0" encoding="utf-8"?>
-<w:styles xmlns:mc="http://schemas.openxmlformats.org/markup-compatibility/2006" xmlns:r="http://schemas.openxmlformats.org/officeDocument/2006/relationships" xmlns:w="http://schemas.openxmlformats.org/wordprocessingml/2006/main" xmlns:w14="http://schemas.microsoft.com/office/word/2010/wordml" xmlns:w15="http://schemas.microsoft.com/office/word/2012/wordml" xmlns:w16cid="http://schemas.microsoft.com/office/word/2016/wordml/cid" xmlns:w16se="http://schemas.microsoft.com/office/word/2015/wordml/symex" mc:Ignorable="w14 w15 w16se w16cid">
+<w:styles xmlns:mc="http://schemas.openxmlformats.org/markup-compatibility/2006" xmlns:r="http://schemas.openxmlformats.org/officeDocument/2006/relationships" xmlns:w="http://schemas.openxmlformats.org/wordprocessingml/2006/main" xmlns:w14="http://schemas.microsoft.com/office/word/2010/wordml" xmlns:w15="http://schemas.microsoft.com/office/word/2012/wordml" xmlns:w16cex="http://schemas.microsoft.com/office/word/2018/wordml/cex" xmlns:w16cid="http://schemas.microsoft.com/office/word/2016/wordml/cid" xmlns:w16="http://schemas.microsoft.com/office/word/2018/wordml" xmlns:w16du="http://schemas.microsoft.com/office/word/2023/wordml/word16du" xmlns:w16sdtdh="http://schemas.microsoft.com/office/word/2020/wordml/sdtdatahash" xmlns:w16sdtfl="http://schemas.microsoft.com/office/word/2024/wordml/sdtformatlock" xmlns:w16se="http://schemas.microsoft.com/office/word/2015/wordml/symex" mc:Ignorable="w14 w15 w16se w16cid w16 w16cex w16sdtdh w16sdtfl w16du">
   <w:docDefaults>
     <w:rPrDefault>
       <w:rPr>
@@ -152,7 +335,7 @@
       </w:pPr>
     </w:pPrDefault>
   </w:docDefaults>
-  <w:latentStyles w:defLockedState="0" w:defUIPriority="99" w:defSemiHidden="0" w:defUnhideWhenUsed="0" w:defQFormat="0" w:count="375">
+  <w:latentStyles w:defLockedState="0" w:defUIPriority="99" w:defSemiHidden="0" w:defUnhideWhenUsed="0" w:defQFormat="0" w:count="376">
     <w:lsdException w:name="Normal" w:uiPriority="0" w:qFormat="1"/>
     <w:lsdException w:name="heading 1" w:uiPriority="9" w:qFormat="1"/>
     <w:lsdException w:name="heading 2" w:semiHidden="1" w:uiPriority="9" w:unhideWhenUsed="1" w:qFormat="1"/>
@@ -528,6 +711,7 @@
     <w:lsdException w:name="Smart Hyperlink" w:semiHidden="1" w:unhideWhenUsed="1"/>
     <w:lsdException w:name="Hashtag" w:semiHidden="1" w:unhideWhenUsed="1"/>
     <w:lsdException w:name="Unresolved Mention" w:semiHidden="1" w:unhideWhenUsed="1"/>
+    <w:lsdException w:name="Smart Link" w:semiHidden="1" w:unhideWhenUsed="1"/>
   </w:latentStyles>
   <w:style w:type="paragraph" w:default="1" w:styleId="Normal">
     <w:name w:val="Normal"/>
@@ -559,6 +743,50 @@
     <w:uiPriority w:val="99"/>
     <w:semiHidden/>
     <w:unhideWhenUsed/>
+  </w:style>
+  <w:style w:type="paragraph" w:styleId="Header">
+    <w:name w:val="header"/>
+    <w:basedOn w:val="Normal"/>
+    <w:link w:val="HeaderChar"/>
+    <w:uiPriority w:val="99"/>
+    <w:unhideWhenUsed/>
+    <w:rsid w:val="00901996"/>
+    <w:pPr>
+      <w:tabs>
+        <w:tab w:val="center" w:pos="4680"/>
+        <w:tab w:val="right" w:pos="9360"/>
+      </w:tabs>
+      <w:spacing w:after="0" w:line="240" w:lineRule="auto"/>
+    </w:pPr>
+  </w:style>
+  <w:style w:type="character" w:customStyle="1" w:styleId="HeaderChar">
+    <w:name w:val="Header Char"/>
+    <w:basedOn w:val="DefaultParagraphFont"/>
+    <w:link w:val="Header"/>
+    <w:uiPriority w:val="99"/>
+    <w:rsid w:val="00901996"/>
+  </w:style>
+  <w:style w:type="paragraph" w:styleId="Footer">
+    <w:name w:val="footer"/>
+    <w:basedOn w:val="Normal"/>
+    <w:link w:val="FooterChar"/>
+    <w:uiPriority w:val="99"/>
+    <w:unhideWhenUsed/>
+    <w:rsid w:val="00901996"/>
+    <w:pPr>
+      <w:tabs>
+        <w:tab w:val="center" w:pos="4680"/>
+        <w:tab w:val="right" w:pos="9360"/>
+      </w:tabs>
+      <w:spacing w:after="0" w:line="240" w:lineRule="auto"/>
+    </w:pPr>
+  </w:style>
+  <w:style w:type="character" w:customStyle="1" w:styleId="FooterChar">
+    <w:name w:val="Footer Char"/>
+    <w:basedOn w:val="DefaultParagraphFont"/>
+    <w:link w:val="Footer"/>
+    <w:uiPriority w:val="99"/>
+    <w:rsid w:val="00901996"/>
   </w:style>
 </w:styles>
 </file>

</xml_diff>